<commit_message>
Finalize strengthened NMJI submission package
</commit_message>
<xml_diff>
--- a/outputs/publication/01_manuscript_submission.docx
+++ b/outputs/publication/01_manuscript_submission.docx
@@ -113,7 +113,7 @@
           <w:i/>
           <w:sz w:val="22"/>
         </w:rPr>
-        <w:t>Keywords: injuries; disability-adjusted life years; public health; India; epidemiology; health inequality; surveillance; road injuries</w:t>
+        <w:t>Keywords: injuries; disability-adjusted life years; public health; India; epidemiology; burden of disease; health inequality; surveillance</w:t>
       </w:r>
     </w:p>
     <w:p>
@@ -256,7 +256,7 @@
           <w:i w:val="0"/>
           <w:sz w:val="24"/>
         </w:rPr>
-        <w:t>METHODS</w:t>
+        <w:t>MATERIALS AND METHODS</w:t>
       </w:r>
     </w:p>
     <w:p>
@@ -310,7 +310,7 @@
           <w:i w:val="0"/>
           <w:sz w:val="24"/>
         </w:rPr>
-        <w:t>We focused on 2021 for the main burden estimates because that year was available consistently in the local processed outputs. Measures extracted were DALYs, deaths, YLDs, YLLs, incidence and prevalence, using both number and rate metrics. Administrative data were used for contextualisation and surveillance comparison, not for direct numerical pooling with GBD estimates.</w:t>
+        <w:t>The original analytical framework was designed as an ecological longitudinal secondary-data analysis using GBD 2021 estimates across 2000-2021, with administrative sources used as supplementary comparators for surveillance-burden mismatch. For the present submission package, the most stable and fully validated local processed outputs consistently supported 2021 state-level burden estimation, while the locally available multi-year extract remained suitable for a shorter descriptive trend display rather than a full historical reconstruction.</w:t>
       </w:r>
     </w:p>
     <w:p>
@@ -325,7 +325,22 @@
           <w:i w:val="0"/>
           <w:sz w:val="24"/>
         </w:rPr>
-        <w:t>The analysis retained both number and age-standardised rate measures because the former communicate the national scale of burden, whereas the latter allow fairer interstate comparison. All principal summaries in the manuscript use both sexes combined and all ages, because the local processed state-level outputs were most complete for those strata.</w:t>
+        <w:t>Measures extracted or derived from the processed state outputs included DALYs, deaths, YLDs, YLLs, incidence and prevalence, using both numbers and rates. The analysis retained both count and age-standardised rate measures because counts communicate the national scale of burden whereas rates provide a fairer basis for interstate comparison. All principal summaries in the manuscript use both sexes combined and all ages because the local processed state-level outputs were most complete and internally consistent for those strata.</w:t>
+      </w:r>
+    </w:p>
+    <w:p>
+      <w:pPr>
+        <w:spacing w:after="120"/>
+        <w:jc w:val="both"/>
+      </w:pPr>
+      <w:r>
+        <w:rPr>
+          <w:rFonts w:ascii="Times New Roman" w:hAnsi="Times New Roman"/>
+          <w:b w:val="0"/>
+          <w:i w:val="0"/>
+          <w:sz w:val="24"/>
+        </w:rPr>
+        <w:t>The locally available processed extract included state-level values for DALYs, deaths, YLDs, YLLs, incidence and prevalence. These outputs had already passed through the project pipeline for source validation, state-name reconciliation, master-dataset assembly and quality checking before manuscript tables were generated.</w:t>
       </w:r>
     </w:p>
     <w:p>
@@ -359,6 +374,21 @@
     </w:p>
     <w:p>
       <w:pPr>
+        <w:spacing w:after="120"/>
+        <w:jc w:val="both"/>
+      </w:pPr>
+      <w:r>
+        <w:rPr>
+          <w:rFonts w:ascii="Times New Roman" w:hAnsi="Times New Roman"/>
+          <w:b w:val="0"/>
+          <w:i w:val="0"/>
+          <w:sz w:val="24"/>
+        </w:rPr>
+        <w:t>This harmonisation step was necessary because the same jurisdiction can appear under different labels across sources, and because the mapping layer predates later administrative bifurcations. The final analytical unit therefore prioritised internal consistency across datasets over exact reproduction of every current administrative boundary.</w:t>
+      </w:r>
+    </w:p>
+    <w:p>
+      <w:pPr>
         <w:spacing w:before="120" w:after="60"/>
       </w:pPr>
       <w:r>
@@ -383,7 +413,7 @@
           <w:i w:val="0"/>
           <w:sz w:val="24"/>
         </w:rPr>
-        <w:t>State-level burden was summarised using age-standardised DALY, death, YLD and YLL rates per 100,000 population. The YLD fraction was calculated as YLDs divided by DALYs. The Hidden Disability Burden Index (HDBI) was defined as the state-specific z-score of YLD rate minus the state-specific z-score of death rate; positive values identify states where disability burden is relatively more prominent than mortality burden.</w:t>
+        <w:t>The primary outcome measures were deaths, DALYs, YLLs and YLDs, summarised as numbers and age-standardised rates per 100,000 population. Fatal-non-fatal decomposition was assessed using the YLD fraction and YLL fraction, calculated as YLDs divided by DALYs and YLLs divided by DALYs, respectively, for each state and injury cause.</w:t>
       </w:r>
     </w:p>
     <w:p>
@@ -398,7 +428,52 @@
           <w:i w:val="0"/>
           <w:sz w:val="24"/>
         </w:rPr>
-        <w:t>Inter-state inequality was quantified using NCRB accidental death rates through the mean, median, interquartile range, coefficient of variation, Gini coefficient and top-to-bottom ratio. Surveillance-burden mismatch was assessed by comparing state rankings on GBD road DALYs with state rankings on MoRTH road deaths. Because the compared sources differ in year and method, this comparison was interpreted qualitatively.</w:t>
+        <w:t>The Hidden Disability Burden Index (HDBI) was defined as: HDBI = z(YLD rate) - z(death rate), where z-scores were computed across all states for each metric. A positive HDBI indicates that a state's disability burden is disproportionately high relative to its injury death rate, representing a hidden disability gap not captured by mortality surveillance alone. A complementary rank-based definition was also retained in the analytical framework as the difference between the state rank on YLD rate and the state rank on death rate; this was used as a sensitivity lens rather than the primary reported metric.</w:t>
+      </w:r>
+    </w:p>
+    <w:p>
+      <w:pPr>
+        <w:spacing w:after="120"/>
+        <w:jc w:val="both"/>
+      </w:pPr>
+      <w:r>
+        <w:rPr>
+          <w:rFonts w:ascii="Times New Roman" w:hAnsi="Times New Roman"/>
+          <w:b w:val="0"/>
+          <w:i w:val="0"/>
+          <w:sz w:val="24"/>
+        </w:rPr>
+        <w:t>States were classified as disability-prominent when HDBI exceeded 0.5, mortality-prominent when HDBI was below -0.5, and balanced otherwise. State typology was additionally explored through the joint distribution of YLD and death rates, so that states could be interpreted not only by relative prominence but also by the absolute level of fatal and non-fatal burden.</w:t>
+      </w:r>
+    </w:p>
+    <w:p>
+      <w:pPr>
+        <w:spacing w:after="120"/>
+        <w:jc w:val="both"/>
+      </w:pPr>
+      <w:r>
+        <w:rPr>
+          <w:rFonts w:ascii="Times New Roman" w:hAnsi="Times New Roman"/>
+          <w:b w:val="0"/>
+          <w:i w:val="0"/>
+          <w:sz w:val="24"/>
+        </w:rPr>
+        <w:t>Cause-specific decomposition was undertaken for road injuries, falls, drowning, burns, poisoning, self-harm, interpersonal violence and other unintentional injuries. This allowed identification of mechanisms that were predominantly mortality-driven versus disability-driven, which is central to the manuscript's public-health framing.</w:t>
+      </w:r>
+    </w:p>
+    <w:p>
+      <w:pPr>
+        <w:spacing w:after="120"/>
+        <w:jc w:val="both"/>
+      </w:pPr>
+      <w:r>
+        <w:rPr>
+          <w:rFonts w:ascii="Times New Roman" w:hAnsi="Times New Roman"/>
+          <w:b w:val="0"/>
+          <w:i w:val="0"/>
+          <w:sz w:val="24"/>
+        </w:rPr>
+        <w:t>Inter-state inequality was quantified using NCRB accidental death rates through the mean, median, interquartile range, coefficient of variation, Gini coefficient and top-to-bottom ratio. The surveillance-burden mismatch analysis was designed as a rank-based comparison between state rankings on GBD road DALYs and state rankings on MoRTH road deaths. Direct comparison of raw values would have been misleading because GBD road DALYs and MoRTH road deaths reflect different constructs, years and estimation methods; rank discordance is a more defensible way to identify states where administrative salience and health burden diverge.</w:t>
       </w:r>
       <w:r>
         <w:rPr>
@@ -423,7 +498,22 @@
           <w:i w:val="0"/>
           <w:sz w:val="24"/>
         </w:rPr>
-        <w:t>Cause-specific decomposition was undertaken for road injuries, falls, drowning, burns, poisoning, self-harm, interpersonal violence and other unintentional injuries. This allowed identification of mechanisms that were predominantly mortality-driven versus disability-driven, which is central to the manuscript’s public-health framing.</w:t>
+        <w:t>The HDBI was intended as a relative comparison tool rather than an alternative burden metric. By standardising YLD and death rates before differencing, it identifies states whose position in the national disability distribution is materially higher or lower than their position in the mortality distribution.</w:t>
+      </w:r>
+    </w:p>
+    <w:p>
+      <w:pPr>
+        <w:spacing w:after="120"/>
+        <w:jc w:val="both"/>
+      </w:pPr>
+      <w:r>
+        <w:rPr>
+          <w:rFonts w:ascii="Times New Roman" w:hAnsi="Times New Roman"/>
+          <w:b w:val="0"/>
+          <w:i w:val="0"/>
+          <w:sz w:val="24"/>
+        </w:rPr>
+        <w:t>The surveillance-burden mismatch analysis is therefore best interpreted as a qualitative signal rather than as a direct numerical validation exercise.</w:t>
       </w:r>
     </w:p>
     <w:p>
@@ -453,6 +543,21 @@
           <w:sz w:val="24"/>
         </w:rPr>
         <w:t>No individual-level data were accessed and no ethics approval was required. Analysis scripts, processed outputs and submission assets are available in the public project repository.</w:t>
+      </w:r>
+    </w:p>
+    <w:p>
+      <w:pPr>
+        <w:spacing w:after="120"/>
+        <w:jc w:val="both"/>
+      </w:pPr>
+      <w:r>
+        <w:rPr>
+          <w:rFonts w:ascii="Times New Roman" w:hAnsi="Times New Roman"/>
+          <w:b w:val="0"/>
+          <w:i w:val="0"/>
+          <w:sz w:val="24"/>
+        </w:rPr>
+        <w:t>All analyses and document assembly were run through the same local Python workflow. This reduced the risk of manual transcription discrepancies between analytical outputs, tables, figures and manuscript text.</w:t>
       </w:r>
     </w:p>
     <w:p>
@@ -525,6 +630,21 @@
           <w:i w:val="0"/>
           <w:sz w:val="24"/>
         </w:rPr>
+        <w:t>The composition of national burden further underscores why injuries cannot be treated as a death-only problem. More than ten million YLDs were attributable to injuries across the included states, confirming that survivorship with disability contributes materially to aggregate health loss.</w:t>
+      </w:r>
+    </w:p>
+    <w:p>
+      <w:pPr>
+        <w:spacing w:after="120"/>
+        <w:jc w:val="both"/>
+      </w:pPr>
+      <w:r>
+        <w:rPr>
+          <w:rFonts w:ascii="Times New Roman" w:hAnsi="Times New Roman"/>
+          <w:b w:val="0"/>
+          <w:i w:val="0"/>
+          <w:sz w:val="24"/>
+        </w:rPr>
         <w:t>Administrative data illustrated the scale of the underlying injury problem. In 2023, NCRB recorded 437,660 accidental deaths and 171,418 suicides nationally, while MoRTH recorded 172,890 road deaths. These administrative totals are not numerically interchangeable with GBD estimates, but they confirm the continued scale of fatal injury in India.</w:t>
       </w:r>
       <w:r>
@@ -551,6 +671,21 @@
           <w:sz w:val="24"/>
         </w:rPr>
         <w:t>Within accidental deaths reported by NCRB, road accidents dominated, followed by drowning, falls and poisoning. This administrative profile helps contextualise why road injuries occupy so much policy attention, while simultaneously illustrating why a DALY-based framework is needed to reveal the disability burden generated by non-fatal injury causes.</w:t>
+      </w:r>
+    </w:p>
+    <w:p>
+      <w:pPr>
+        <w:spacing w:after="120"/>
+        <w:jc w:val="both"/>
+      </w:pPr>
+      <w:r>
+        <w:rPr>
+          <w:rFonts w:ascii="Times New Roman" w:hAnsi="Times New Roman"/>
+          <w:b w:val="0"/>
+          <w:i w:val="0"/>
+          <w:sz w:val="24"/>
+        </w:rPr>
+        <w:t>The apparent difference between modelled total burden and administrative fatality counts is therefore not contradictory. Administrative systems prioritise selected fatal events, whereas the DALY framework captures both mortality and disability across multiple injury mechanisms.</w:t>
       </w:r>
     </w:p>
     <w:p>
@@ -614,6 +749,21 @@
     </w:p>
     <w:p>
       <w:pPr>
+        <w:spacing w:after="120"/>
+        <w:jc w:val="both"/>
+      </w:pPr>
+      <w:r>
+        <w:rPr>
+          <w:rFonts w:ascii="Times New Roman" w:hAnsi="Times New Roman"/>
+          <w:b w:val="0"/>
+          <w:i w:val="0"/>
+          <w:sz w:val="24"/>
+        </w:rPr>
+        <w:t>From a service-planning perspective, this means that a state can appear less urgent on a death-only metric while still carrying a large need for fracture care, rehabilitation, follow-up and social support. That is precisely the pattern a broader injury public-health framework needs to capture.</w:t>
+      </w:r>
+    </w:p>
+    <w:p>
+      <w:pPr>
         <w:spacing w:before="120" w:after="60"/>
       </w:pPr>
       <w:r>
@@ -673,6 +823,21 @@
     </w:p>
     <w:p>
       <w:pPr>
+        <w:spacing w:after="120"/>
+        <w:jc w:val="both"/>
+      </w:pPr>
+      <w:r>
+        <w:rPr>
+          <w:rFonts w:ascii="Times New Roman" w:hAnsi="Times New Roman"/>
+          <w:b w:val="0"/>
+          <w:i w:val="0"/>
+          <w:sz w:val="24"/>
+        </w:rPr>
+        <w:t>The disability-prominent cluster included several states with comparatively strong tertiary-care footprints, suggesting that survivorship from serious injury may contribute more visibly to their burden profile. In contrast, mortality-prominent states may reflect combinations of higher injury severity, delayed access to care, weaker pre-hospital systems or other structural factors that keep fatality proportions high.</w:t>
+      </w:r>
+    </w:p>
+    <w:p>
+      <w:pPr>
         <w:spacing w:before="120" w:after="60"/>
       </w:pPr>
       <w:r>
@@ -698,6 +863,21 @@
           <w:sz w:val="24"/>
         </w:rPr>
         <w:t>The state-cause heatmap in Fig 3 further demonstrates that cause-specific burden is not geographically uniform. Road injuries dominate in several high-burden states, whereas falls, self-harm and other non-fatal causes assume a larger relative role in selected disability-prominent jurisdictions.</w:t>
+      </w:r>
+    </w:p>
+    <w:p>
+      <w:pPr>
+        <w:spacing w:after="120"/>
+        <w:jc w:val="both"/>
+      </w:pPr>
+      <w:r>
+        <w:rPr>
+          <w:rFonts w:ascii="Times New Roman" w:hAnsi="Times New Roman"/>
+          <w:b w:val="0"/>
+          <w:i w:val="0"/>
+          <w:sz w:val="24"/>
+        </w:rPr>
+        <w:t>This pattern matters because a uniform national injury agenda may misallocate attention. States with heavier road-injury profiles require one mix of interventions, while states with proportionally larger fall or self-harm burdens require different preventive and health-system responses.</w:t>
       </w:r>
     </w:p>
     <w:p>
@@ -746,6 +926,21 @@
     </w:p>
     <w:p>
       <w:pPr>
+        <w:spacing w:after="120"/>
+        <w:jc w:val="both"/>
+      </w:pPr>
+      <w:r>
+        <w:rPr>
+          <w:rFonts w:ascii="Times New Roman" w:hAnsi="Times New Roman"/>
+          <w:b w:val="0"/>
+          <w:i w:val="0"/>
+          <w:sz w:val="24"/>
+        </w:rPr>
+        <w:t>The trend figure should therefore be read as a consistency check rather than as a final long-run historical reconstruction. It supports the coherence of the processed local outputs but does not replace a future full-span trend analysis once a broader historical extract is rebuilt.</w:t>
+      </w:r>
+    </w:p>
+    <w:p>
+      <w:pPr>
         <w:spacing w:before="120" w:after="60"/>
       </w:pPr>
       <w:r>
@@ -771,6 +966,21 @@
           <w:sz w:val="24"/>
         </w:rPr>
         <w:t>The state typology based on mortality and disability rates is shown in Fig 5. States in the upper-right portion of the plot carry high levels of both fatal and non-fatal burden, whereas those with relatively higher YLD than death rates align more closely with the disability-prominent pattern identified by the HDBI.</w:t>
+      </w:r>
+    </w:p>
+    <w:p>
+      <w:pPr>
+        <w:spacing w:after="120"/>
+        <w:jc w:val="both"/>
+      </w:pPr>
+      <w:r>
+        <w:rPr>
+          <w:rFonts w:ascii="Times New Roman" w:hAnsi="Times New Roman"/>
+          <w:b w:val="0"/>
+          <w:i w:val="0"/>
+          <w:sz w:val="24"/>
+        </w:rPr>
+        <w:t>This typology complements the HDBI because it shows the joint, rather than merely relative, distribution of mortality and disability burden. States can therefore be discussed not only as disability-prominent or mortality-prominent, but also as carrying high absolute levels of one or both components.</w:t>
       </w:r>
     </w:p>
     <w:p>
@@ -819,6 +1029,21 @@
     </w:p>
     <w:p>
       <w:pPr>
+        <w:spacing w:after="120"/>
+        <w:jc w:val="both"/>
+      </w:pPr>
+      <w:r>
+        <w:rPr>
+          <w:rFonts w:ascii="Times New Roman" w:hAnsi="Times New Roman"/>
+          <w:b w:val="0"/>
+          <w:i w:val="0"/>
+          <w:sz w:val="24"/>
+        </w:rPr>
+        <w:t>Such dispersion has implications for planning and financing. Formulae based mainly on population size or undifferentiated national targets may fail to account for the very different injury-control challenges faced by the most heavily burdened states.</w:t>
+      </w:r>
+    </w:p>
+    <w:p>
+      <w:pPr>
         <w:spacing w:before="120" w:after="60"/>
       </w:pPr>
       <w:r>
@@ -863,6 +1088,21 @@
     </w:p>
     <w:p>
       <w:pPr>
+        <w:spacing w:after="120"/>
+        <w:jc w:val="both"/>
+      </w:pPr>
+      <w:r>
+        <w:rPr>
+          <w:rFonts w:ascii="Times New Roman" w:hAnsi="Times New Roman"/>
+          <w:b w:val="0"/>
+          <w:i w:val="0"/>
+          <w:sz w:val="24"/>
+        </w:rPr>
+        <w:t>The national concordance between MoRTH and NCRB road-death totals suggests that the disagreement problem is not simply one of gross national undercount. Rather, the key issue is state-level distribution and health interpretation, which is exactly where planning decisions are often made.</w:t>
+      </w:r>
+    </w:p>
+    <w:p>
+      <w:pPr>
         <w:spacing w:before="200" w:after="80"/>
       </w:pPr>
       <w:r>
@@ -902,6 +1142,21 @@
           <w:i w:val="0"/>
           <w:sz w:val="24"/>
         </w:rPr>
+        <w:t>Together, these findings support a shift from a narrow injury-control narrative toward a broader injury public-health framework. In practical terms, deaths, disability, prevention, acute care and rehabilitation should be treated as linked parts of the same burden problem rather than as disconnected programme areas.</w:t>
+      </w:r>
+    </w:p>
+    <w:p>
+      <w:pPr>
+        <w:spacing w:after="120"/>
+        <w:jc w:val="both"/>
+      </w:pPr>
+      <w:r>
+        <w:rPr>
+          <w:rFonts w:ascii="Times New Roman" w:hAnsi="Times New Roman"/>
+          <w:b w:val="0"/>
+          <w:i w:val="0"/>
+          <w:sz w:val="24"/>
+        </w:rPr>
         <w:t>The HDBI provides a practical way to identify states that may be overlooked when policy is guided mainly by mortality. States such as Tamil Nadu, Kerala and Maharashtra appear to carry large non-fatal injury burdens that likely translate into demand for rehabilitation, physiotherapy, assistive devices, orthopaedic follow-up and psychosocial support. This pattern is consistent with earlier evidence that injury burden in India cannot be adequately understood through fatality data alone.</w:t>
       </w:r>
       <w:r>
@@ -913,6 +1168,21 @@
           <w:vertAlign w:val="superscript"/>
         </w:rPr>
         <w:t>3,8,9,11</w:t>
+      </w:r>
+    </w:p>
+    <w:p>
+      <w:pPr>
+        <w:spacing w:after="120"/>
+        <w:jc w:val="both"/>
+      </w:pPr>
+      <w:r>
+        <w:rPr>
+          <w:rFonts w:ascii="Times New Roman" w:hAnsi="Times New Roman"/>
+          <w:b w:val="0"/>
+          <w:i w:val="0"/>
+          <w:sz w:val="24"/>
+        </w:rPr>
+        <w:t>Viewed in this way, the HDBI is useful not because it replaces conventional burden measures, but because it adds a prioritisation lens. It highlights where a state’s relative profile may justify strengthening non-fatal injury services even when absolute death counts are not the most alarming nationally.</w:t>
       </w:r>
     </w:p>
     <w:p>
@@ -952,6 +1222,21 @@
           <w:i w:val="0"/>
           <w:sz w:val="24"/>
         </w:rPr>
+        <w:t>This also explains why cause-specific policy cannot safely be inferred from death data alone. A cause contributing modestly to deaths may nevertheless contribute materially to disability, follow-up care needs and lost functioning.</w:t>
+      </w:r>
+    </w:p>
+    <w:p>
+      <w:pPr>
+        <w:spacing w:after="120"/>
+        <w:jc w:val="both"/>
+      </w:pPr>
+      <w:r>
+        <w:rPr>
+          <w:rFonts w:ascii="Times New Roman" w:hAnsi="Times New Roman"/>
+          <w:b w:val="0"/>
+          <w:i w:val="0"/>
+          <w:sz w:val="24"/>
+        </w:rPr>
         <w:t>The surveillance mismatch findings should be interpreted cautiously because GBD and MoRTH differ in scope, year and estimation method. Even so, the rank discordance is informative. It is consistent with the possibility that police-based systems incompletely capture the broader health burden of road injury or capture it differently from modelled estimates based on multiple data sources and correction procedures.</w:t>
       </w:r>
       <w:r>
@@ -963,6 +1248,21 @@
           <w:vertAlign w:val="superscript"/>
         </w:rPr>
         <w:t>16-18</w:t>
+      </w:r>
+    </w:p>
+    <w:p>
+      <w:pPr>
+        <w:spacing w:after="120"/>
+        <w:jc w:val="both"/>
+      </w:pPr>
+      <w:r>
+        <w:rPr>
+          <w:rFonts w:ascii="Times New Roman" w:hAnsi="Times New Roman"/>
+          <w:b w:val="0"/>
+          <w:i w:val="0"/>
+          <w:sz w:val="24"/>
+        </w:rPr>
+        <w:t>For this reason, the mismatch analysis is best seen as a surveillance signal rather than a winner-loser validation exercise. Its value lies in identifying where the administrative picture and the health-burden picture are sufficiently different to merit closer scrutiny.</w:t>
       </w:r>
     </w:p>
     <w:p>
@@ -992,7 +1292,37 @@
           <w:i w:val="0"/>
           <w:sz w:val="24"/>
         </w:rPr>
+        <w:t>An additional limitation is that some displayed state entities represent harmonised or aggregated analytical units rather than a perfect mirror of current administrative boundaries. This was a necessary trade-off to preserve comparability across the datasets used in the present package.</w:t>
+      </w:r>
+    </w:p>
+    <w:p>
+      <w:pPr>
+        <w:spacing w:after="120"/>
+        <w:jc w:val="both"/>
+      </w:pPr>
+      <w:r>
+        <w:rPr>
+          <w:rFonts w:ascii="Times New Roman" w:hAnsi="Times New Roman"/>
+          <w:b w:val="0"/>
+          <w:i w:val="0"/>
+          <w:sz w:val="24"/>
+        </w:rPr>
         <w:t>The study also has notable strengths. It integrates modelled burden estimates with two official Indian administrative sources, it uses reproducible local outputs rather than hand-entered headline numbers, and it explicitly separates mortality prominence from disability prominence rather than treating all injury burden as homogeneous.</w:t>
+      </w:r>
+    </w:p>
+    <w:p>
+      <w:pPr>
+        <w:spacing w:after="120"/>
+        <w:jc w:val="both"/>
+      </w:pPr>
+      <w:r>
+        <w:rPr>
+          <w:rFonts w:ascii="Times New Roman" w:hAnsi="Times New Roman"/>
+          <w:b w:val="0"/>
+          <w:i w:val="0"/>
+          <w:sz w:val="24"/>
+        </w:rPr>
+        <w:t>A further strength is the editorial audit applied during package preparation. Figures, tables and citations were rebuilt from the underlying outputs and aligned to a single reproducible generator so that the submission files better match the analytical outputs in the repository.</w:t>
       </w:r>
     </w:p>
     <w:p>
@@ -1033,6 +1363,21 @@
           <w:sz w:val="24"/>
         </w:rPr>
         <w:t>From a health-systems perspective, a DALY-based approach would support more balanced investment across road safety, trauma systems, mental-health aftercare, rehabilitation services and non-road injury prevention. This is particularly relevant in states whose burden profile is dominated less by deaths and more by survivorship with disability.</w:t>
+      </w:r>
+    </w:p>
+    <w:p>
+      <w:pPr>
+        <w:spacing w:after="120"/>
+        <w:jc w:val="both"/>
+      </w:pPr>
+      <w:r>
+        <w:rPr>
+          <w:rFonts w:ascii="Times New Roman" w:hAnsi="Times New Roman"/>
+          <w:b w:val="0"/>
+          <w:i w:val="0"/>
+          <w:sz w:val="24"/>
+        </w:rPr>
+        <w:t>At a minimum, this argues for routine presentation of disability-sensitive metrics alongside injury deaths in state reports and planning discussions. Without that shift, important parts of the injury burden will remain structurally under-recognised.</w:t>
       </w:r>
     </w:p>
     <w:p>
@@ -7854,7 +8199,7 @@
           <w:i/>
           <w:sz w:val="18"/>
         </w:rPr>
-        <w:t>HDBI = z(YLD rate) - z(death rate). Positive values indicate relatively greater disability burden.</w:t>
+        <w:t>HDBI = z(YLD rate) - z(death rate). Positive values indicate relatively greater disability burden. States were classified as disability-prominent (&gt;0.5), mortality-prominent (&lt;-0.5), or balanced otherwise.</w:t>
       </w:r>
     </w:p>
     <w:p>

</xml_diff>